<commit_message>
Added photos in document
</commit_message>
<xml_diff>
--- a/OOD Theory/Assignment 1/A01 25i-6180.docx
+++ b/OOD Theory/Assignment 1/A01 25i-6180.docx
@@ -414,14 +414,12 @@
               </w:rPr>
               <w:t xml:space="preserve"> </w:t>
             </w:r>
-            <w:proofErr w:type="spellStart"/>
             <w:r>
               <w:rPr>
                 <w:rFonts w:ascii="Arial MT"/>
               </w:rPr>
               <w:t>Shahid</w:t>
             </w:r>
-            <w:proofErr w:type="spellEnd"/>
             <w:r>
               <w:rPr>
                 <w:rFonts w:ascii="Arial MT"/>
@@ -2238,7 +2236,7 @@
           </mc:Choice>
           <mc:Fallback>
             <w:pict>
-              <v:shape w14:anchorId="154E8E77" id="Graphic 1" o:spid="_x0000_s1026" style="position:absolute;margin-left:36pt;margin-top:10.65pt;width:461.6pt;height:.1pt;z-index:-15728640;visibility:visible;mso-wrap-style:square;mso-wrap-distance-left:0;mso-wrap-distance-top:0;mso-wrap-distance-right:0;mso-wrap-distance-bottom:0;mso-position-horizontal:absolute;mso-position-horizontal-relative:page;mso-position-vertical:absolute;mso-position-vertical-relative:text;v-text-anchor:top" coordsize="5862320,1270" o:gfxdata="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" path="m,l5861993,e" filled="f" strokeweight=".31597mm">
+              <v:shape w14:anchorId="6FE11C74" id="Graphic 1" o:spid="_x0000_s1026" style="position:absolute;margin-left:36pt;margin-top:10.65pt;width:461.6pt;height:.1pt;z-index:-15728640;visibility:visible;mso-wrap-style:square;mso-wrap-distance-left:0;mso-wrap-distance-top:0;mso-wrap-distance-right:0;mso-wrap-distance-bottom:0;mso-position-horizontal:absolute;mso-position-horizontal-relative:page;mso-position-vertical:absolute;mso-position-vertical-relative:text;v-text-anchor:top" coordsize="5862320,1270" o:gfxdata="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" path="m,l5861993,e" filled="f" strokeweight=".31597mm">
                 <v:path arrowok="t"/>
                 <w10:wrap type="topAndBottom" anchorx="page"/>
               </v:shape>
@@ -3852,13 +3850,7 @@
               <w:rPr>
                 <w:sz w:val="24"/>
               </w:rPr>
-              <w:t>O</w:t>
-            </w:r>
-            <w:r>
-              <w:rPr>
-                <w:sz w:val="24"/>
-              </w:rPr>
-              <w:t>verload</w:t>
+              <w:t>Overload</w:t>
             </w:r>
             <w:r>
               <w:rPr>
@@ -4248,10 +4240,80 @@
         <w:rPr>
           <w:rFonts w:ascii="Times New Roman" w:hAnsi="Times New Roman" w:cs="Times New Roman"/>
         </w:rPr>
-        <w:t xml:space="preserve">All required are working properly. For the identity operator the unary operator “!” was used. </w:t>
+        <w:t>All required are working properly. For the identity operator the unary operator “!” was used.</w:t>
+      </w:r>
+    </w:p>
+    <w:p>
+      <w:pPr>
+        <w:pStyle w:val="BodyText"/>
+        <w:spacing w:before="4" w:line="360" w:lineRule="auto"/>
+        <w:rPr>
+          <w:rFonts w:ascii="Times New Roman" w:hAnsi="Times New Roman" w:cs="Times New Roman"/>
+        </w:rPr>
+      </w:pPr>
+      <w:r>
+        <w:rPr>
+          <w:rFonts w:ascii="Times New Roman" w:hAnsi="Times New Roman" w:cs="Times New Roman"/>
+        </w:rPr>
+        <w:t>Output:</w:t>
       </w:r>
       <w:bookmarkStart w:id="0" w:name="_GoBack"/>
       <w:bookmarkEnd w:id="0"/>
+    </w:p>
+    <w:p>
+      <w:pPr>
+        <w:pStyle w:val="BodyText"/>
+        <w:spacing w:before="4"/>
+        <w:rPr>
+          <w:rFonts w:ascii="Times New Roman" w:hAnsi="Times New Roman" w:cs="Times New Roman"/>
+        </w:rPr>
+      </w:pPr>
+      <w:r>
+        <w:rPr>
+          <w:noProof/>
+        </w:rPr>
+        <w:drawing>
+          <wp:inline distT="0" distB="0" distL="0" distR="0" wp14:anchorId="3DFEDAFA" wp14:editId="6E6CD83A">
+            <wp:extent cx="3781425" cy="4219575"/>
+            <wp:effectExtent l="0" t="0" r="9525" b="9525"/>
+            <wp:docPr id="2" name="Picture 2"/>
+            <wp:cNvGraphicFramePr>
+              <a:graphicFrameLocks xmlns:a="http://schemas.openxmlformats.org/drawingml/2006/main" noChangeAspect="1"/>
+            </wp:cNvGraphicFramePr>
+            <a:graphic xmlns:a="http://schemas.openxmlformats.org/drawingml/2006/main">
+              <a:graphicData uri="http://schemas.openxmlformats.org/drawingml/2006/picture">
+                <pic:pic xmlns:pic="http://schemas.openxmlformats.org/drawingml/2006/picture">
+                  <pic:nvPicPr>
+                    <pic:cNvPr id="1" name=""/>
+                    <pic:cNvPicPr/>
+                  </pic:nvPicPr>
+                  <pic:blipFill>
+                    <a:blip r:embed="rId7"/>
+                    <a:stretch>
+                      <a:fillRect/>
+                    </a:stretch>
+                  </pic:blipFill>
+                  <pic:spPr>
+                    <a:xfrm>
+                      <a:off x="0" y="0"/>
+                      <a:ext cx="3781425" cy="4219575"/>
+                    </a:xfrm>
+                    <a:prstGeom prst="rect">
+                      <a:avLst/>
+                    </a:prstGeom>
+                  </pic:spPr>
+                </pic:pic>
+              </a:graphicData>
+            </a:graphic>
+          </wp:inline>
+        </w:drawing>
+      </w:r>
+      <w:r>
+        <w:rPr>
+          <w:rFonts w:ascii="Times New Roman" w:hAnsi="Times New Roman" w:cs="Times New Roman"/>
+        </w:rPr>
+        <w:t xml:space="preserve"> </w:t>
+      </w:r>
     </w:p>
     <w:sectPr>
       <w:pgSz w:w="12240" w:h="15840"/>

</xml_diff>